<commit_message>
fix(enquadramento): Secção 5 — coimas Art. 61.º/62.º com "o mais elevado"
Corrige erro factual que invertia a lei: "o que for mais baixo" →
"o que for mais elevado" (Art. 61.º/2 e Art. 62.º/2 DL 125/2025).
Aplica a ambos os escalões (muito grave e grave) e a ambas as
categorias (essencial e importante). Altera também "VN global" →
"VN mundial" (terminologia do diploma). Regenera o .docx binário.

Ficheiros: scripts/create-enquadramento-template.ts
           backend/assets/templates/enquadramento-template.docx

Co-Authored-By: Claude Sonnet 4.6 <noreply@anthropic.com>
</commit_message>
<xml_diff>
--- a/backend/assets/templates/enquadramento-template.docx
+++ b/backend/assets/templates/enquadramento-template.docx
@@ -323,27 +323,27 @@
           </w:tcPr>
           <w:p>
             <w:r>
-              <w:t xml:space="preserve">até 10 000 000 € ou 2% do VN global</w:t>
-            </w:r>
-          </w:p>
-        </w:tc>
-        <w:tc>
-          <w:tcPr>
-            <w:tcW w:w="0" w:type="auto"/>
-          </w:tcPr>
-          <w:p>
-            <w:r>
-              <w:t xml:space="preserve">até 7 000 000 € ou 1,4% do VN global</w:t>
-            </w:r>
-          </w:p>
-        </w:tc>
-        <w:tc>
-          <w:tcPr>
-            <w:tcW w:w="0" w:type="auto"/>
-          </w:tcPr>
-          <w:p>
-            <w:r>
-              <w:t xml:space="preserve">Art. 61.º DL 125/2025</w:t>
+              <w:t xml:space="preserve">até 10 000 000 € ou 2% do VN mundial, o que for mais elevado</w:t>
+            </w:r>
+          </w:p>
+        </w:tc>
+        <w:tc>
+          <w:tcPr>
+            <w:tcW w:w="0" w:type="auto"/>
+          </w:tcPr>
+          <w:p>
+            <w:r>
+              <w:t xml:space="preserve">até 7 000 000 € ou 1,4% do VN mundial, o que for mais elevado</w:t>
+            </w:r>
+          </w:p>
+        </w:tc>
+        <w:tc>
+          <w:tcPr>
+            <w:tcW w:w="0" w:type="auto"/>
+          </w:tcPr>
+          <w:p>
+            <w:r>
+              <w:t xml:space="preserve">Art. 61.º/2 DL 125/2025</w:t>
             </w:r>
           </w:p>
         </w:tc>
@@ -365,27 +365,27 @@
           </w:tcPr>
           <w:p>
             <w:r>
-              <w:t xml:space="preserve">até 5 000 000 € ou 1% do VN global</w:t>
-            </w:r>
-          </w:p>
-        </w:tc>
-        <w:tc>
-          <w:tcPr>
-            <w:tcW w:w="0" w:type="auto"/>
-          </w:tcPr>
-          <w:p>
-            <w:r>
-              <w:t xml:space="preserve">até 3 500 000 € ou 0,7% do VN global</w:t>
-            </w:r>
-          </w:p>
-        </w:tc>
-        <w:tc>
-          <w:tcPr>
-            <w:tcW w:w="0" w:type="auto"/>
-          </w:tcPr>
-          <w:p>
-            <w:r>
-              <w:t xml:space="preserve">Art. 62.º DL 125/2025</w:t>
+              <w:t xml:space="preserve">até 5 000 000 € ou 1% do VN mundial, o que for mais elevado</w:t>
+            </w:r>
+          </w:p>
+        </w:tc>
+        <w:tc>
+          <w:tcPr>
+            <w:tcW w:w="0" w:type="auto"/>
+          </w:tcPr>
+          <w:p>
+            <w:r>
+              <w:t xml:space="preserve">até 3 500 000 € ou 0,7% do VN mundial, o que for mais elevado</w:t>
+            </w:r>
+          </w:p>
+        </w:tc>
+        <w:tc>
+          <w:tcPr>
+            <w:tcW w:w="0" w:type="auto"/>
+          </w:tcPr>
+          <w:p>
+            <w:r>
+              <w:t xml:space="preserve">Art. 62.º/2 DL 125/2025</w:t>
             </w:r>
           </w:p>
         </w:tc>

</xml_diff>

<commit_message>
fix(enquadramento): corrigir base legal e ramificar relatório por classificação
Nove correções ao template e ao gerador (C-EQ9):
- C7: {classificacaoLabel} substitui {classificacao}
- C1: blocos {#isFora}/{#isAConfirmar} antes da Secção 3
- Títulos das Secções 3, 4, 5 via variáveis de template
- C2: datas e artigos corrigidos na abertura da Secção 3
- C3: prazos de registo 60/30 dias úteis (~15 setembro 2026)
- C4: artigos 14.º e 15.º do Regulamento n.º 756/2026
- C5: Secção 4 com artigo 33.º e data 22 junho 2028
- C6: nota sobre alíneas b), c), f) — efeitos diferidos
- C9: item IP com Regulamento n.º 756/2026 e FQDN

Co-Authored-By: Claude Sonnet 4.6 <noreply@anthropic.com>
</commit_message>
<xml_diff>
--- a/backend/assets/templates/enquadramento-template.docx
+++ b/backend/assets/templates/enquadramento-template.docx
@@ -89,7 +89,7 @@
         <w:rPr>
           <w:b/>
         </w:rPr>
-        <w:t xml:space="preserve">{classificacao}</w:t>
+        <w:t xml:space="preserve">{classificacaoLabel}</w:t>
       </w:r>
     </w:p>
     <w:p>
@@ -139,31 +139,67 @@
     <w:p/>
     <w:p>
       <w:r>
-        <w:rPr>
-          <w:b/>
-          <w:sz w:val="28"/>
-        </w:rPr>
-        <w:t xml:space="preserve">3. O que a lei já exige de si hoje</w:t>
-      </w:r>
-    </w:p>
-    <w:p>
-      <w:r>
-        <w:t xml:space="preserve">Estas obrigações estão em vigor desde a publicação do Regulamento n.º 756/2026 (22 de junho de 2026). São de baixo esforço mas de alto risco se esquecidas — o incumprimento é já uma infração:</w:t>
-      </w:r>
-    </w:p>
-    <w:p>
-      <w:r>
-        <w:t xml:space="preserve">  • Registo na plataforma MyCiber (myciber.gov.pt) — Art. 35.º do DL 125/2025.</w:t>
-      </w:r>
-    </w:p>
-    <w:p>
-      <w:r>
-        <w:t xml:space="preserve">  • Designação de responsável de cibersegurança — Art. 31.º do DL 125/2025.</w:t>
-      </w:r>
-    </w:p>
-    <w:p>
-      <w:r>
-        <w:t xml:space="preserve">  • Designação de ponto de contacto permanente com a CNCS — Art. 32.º do DL 125/2025.</w:t>
+        <w:t>{#isFora}</w:t>
+      </w:r>
+    </w:p>
+    <w:p>
+      <w:r>
+        <w:t xml:space="preserve">As secções seguintes descrevem as obrigações aplicáveis às entidades abrangidas pelo Regime Jurídico da Cibersegurança. De acordo com este enquadramento preliminar, a sua organização não é abrangida, pelo que estas obrigações não lhe são exigíveis. São apresentadas a título informativo, para o caso de a situação da organização se alterar ou de se verificarem os critérios qualitativos do artigo 3.º, n.º 2, do RJC.</w:t>
+      </w:r>
+    </w:p>
+    <w:p>
+      <w:r>
+        <w:t>{/isFora}</w:t>
+      </w:r>
+    </w:p>
+    <w:p>
+      <w:r>
+        <w:t>{#isAConfirmar}</w:t>
+      </w:r>
+    </w:p>
+    <w:p>
+      <w:r>
+        <w:t xml:space="preserve">As secções seguintes descrevem as obrigações aplicáveis às entidades abrangidas pelo Regime Jurídico da Cibersegurança. De acordo com este enquadramento preliminar, o enquadramento da sua organização não está determinado, pelo que estas obrigações só lhe serão exigíveis caso se confirme que está abrangida. São apresentadas a título informativo, para o caso de a situação da organização se alterar ou de se verificarem os critérios qualitativos do artigo 3.º, n.º 2, do RJC.</w:t>
+      </w:r>
+    </w:p>
+    <w:p>
+      <w:r>
+        <w:t>{/isAConfirmar}</w:t>
+      </w:r>
+    </w:p>
+    <w:p/>
+    <w:p>
+      <w:r>
+        <w:rPr>
+          <w:b/>
+          <w:sz w:val="28"/>
+        </w:rPr>
+        <w:t xml:space="preserve">{sec3Title}</w:t>
+      </w:r>
+    </w:p>
+    <w:p>
+      <w:r>
+        <w:t xml:space="preserve">Estas obrigações estão em vigor desde a entrada em vigor do Regime Jurídico da Cibersegurança, em 3 de abril de 2026 (artigo 11.º do Decreto-Lei n.º 125/2025). O Regulamento n.º 756/2026, em vigor desde 23 de junho de 2026, não as criou: operacionalizou-as, definindo o funcionamento da plataforma eletrónica MyCiber e os procedimentos de autoidentificação, qualificação, comunicação e notificação.</w:t>
+      </w:r>
+    </w:p>
+    <w:p>
+      <w:r>
+        <w:t xml:space="preserve">  • Registo e autoidentificação na plataforma MyCiber (myciber.gov.pt) — artigo 35.º do DL 125/2025. Prazo: 60 dias úteis a contar da disponibilização da plataforma, ocorrida a 23 de junho de 2026, para as entidades que já se encontravam em atividade; 30 dias úteis para as que iniciem atividade após a entrada em vigor do RJC. O prazo termina por volta de 15 de setembro de 2026. Confirme a data exata junto do CNCS.</w:t>
+      </w:r>
+    </w:p>
+    <w:p>
+      <w:r>
+        <w:t xml:space="preserve">  • Designação de responsável de cibersegurança — artigo 31.º do DL 125/2025.</w:t>
+      </w:r>
+    </w:p>
+    <w:p>
+      <w:r>
+        <w:t xml:space="preserve">  • Designação de ponto de contacto permanente — artigo 32.º do DL 125/2025.</w:t>
+      </w:r>
+    </w:p>
+    <w:p>
+      <w:r>
+        <w:t xml:space="preserve">A comunicação de ambos é feita na área reservada da plataforma, nos termos dos artigos 14.º e 15.º do Regulamento n.º 756/2026. Nos casos previstos no n.º 4 dos artigos 31.º e 32.º do RJC, o prazo conta-se a partir da notificação da qualificação da entidade (artigo 8.º, n.º 5, do RJC).</w:t>
       </w:r>
     </w:p>
     <w:p>
@@ -178,12 +214,12 @@
           <w:b/>
           <w:sz w:val="28"/>
         </w:rPr>
-        <w:t xml:space="preserve">4. O que terá de estar pronto até ~junho de 2028</w:t>
-      </w:r>
-    </w:p>
-    <w:p>
-      <w:r>
-        <w:t xml:space="preserve">As medidas de gestão de risco de cibersegurança (Art. 27.º a 30.º do DL 125/2025) têm um período de adaptação de 24 meses (Art. 10.º/2). O prazo previsto é até cerca de junho de 2028. Incluem, entre outras:</w:t>
+        <w:t xml:space="preserve">{sec4Title}</w:t>
+      </w:r>
+    </w:p>
+    <w:p>
+      <w:r>
+        <w:t xml:space="preserve">O disposto nos n.os 1 e 2 do artigo 27.º, nos artigos 28.º a 30.º e no artigo 33.º do RJC produz efeitos 24 meses após a publicação do Regulamento n.º 756/2026, ou seja, a partir de 22 de junho de 2028 (artigo 10.º, n.º 2, do Decreto-Lei n.º 125/2025).</w:t>
       </w:r>
     </w:p>
     <w:p>
@@ -232,7 +268,7 @@
           <w:b/>
           <w:sz w:val="28"/>
         </w:rPr>
-        <w:t xml:space="preserve">5. Exposição sancionatória</w:t>
+        <w:t xml:space="preserve">{sec5Title}</w:t>
       </w:r>
     </w:p>
     <w:p>
@@ -391,6 +427,14 @@
         </w:tc>
       </w:tr>
     </w:tbl>
+    <w:p>
+      <w:r>
+        <w:rPr>
+          <w:i/>
+        </w:rPr>
+        <w:t xml:space="preserve">Nota: as contraordenações muito graves previstas nas alíneas b), c) e f) do n.º 1 do artigo 61.º do RJC só produzem efeitos a partir de 22 de junho de 2028, nos termos do artigo 10.º, n.º 2, do Decreto-Lei n.º 125/2025.</w:t>
+      </w:r>
+    </w:p>
     <w:p/>
     <w:p>
       <w:r>
@@ -418,7 +462,7 @@
     </w:p>
     <w:p>
       <w:r>
-        <w:t xml:space="preserve">  • Lista de endereços IP e gamas de rede da organização — o CISPLAN já dispõe desta informação do scan.</w:t>
+        <w:t xml:space="preserve">  • Lista de ativos publicamente acessíveis — artigo 32.º do Regulamento n.º 756/2026. Abrange todos os ativos diretamente acessíveis pela Internet, com indicação do serviço suportado, nome do equipamento ou software, modelo e versão, sistema operativo, software do servidor aplicacional, endereço IP, FQDN, fabricante e dependências entre ativos. Constitui informação classificada de grau reservado e é atualizada anualmente. A versão inicial é comunicada até 31 de janeiro do ano seguinte ao da notificação de qualificação, ou no prazo de seis meses após essa notificação, consoante o que ocorrer primeiro. O scan externo do CISPLAN recolhe já a maior parte destes elementos.</w:t>
       </w:r>
     </w:p>
     <w:p>

</xml_diff>

<commit_message>
fix(enquadramento): ramificar secções 5 e 8; teste da fronteira grande/média
- sec5Intro: texto diferente para fora/a_confirmar vs essencial/importante
  (substitui frase fixa que dizia "a sua categoria" a entidades não abrangidas)
- sec5Intro usa "artigos" e "autoridade de cibersegurança competente"
- isAbrangida: secção 8 ramificada em três blocos condicionais
  (essencial/importante, fora_condicional, a_confirmar)
- confidencialidade e equipa CISPLAN fora dos condicionais (aplicam-se a todos)
- [EQ8-T7]: N=200 VN=60 B=desconhecido → a_confirmar (fronteira média/grande)
- 25/25 testes verdes; tsc=7 (baseline)

Co-Authored-By: Claude Sonnet 4.6 <noreply@anthropic.com>
</commit_message>
<xml_diff>
--- a/backend/assets/templates/enquadramento-template.docx
+++ b/backend/assets/templates/enquadramento-template.docx
@@ -273,7 +273,7 @@
     </w:p>
     <w:p>
       <w:r>
-        <w:t xml:space="preserve">Escalões aplicáveis à sua categoria (Art. 61.º e 62.º do DL 125/2025). Os valores são tetos máximos; a coima concreta é fixada caso a caso pela CNCS. Há um caminho de conformidade e ainda há tempo.</w:t>
+        <w:t xml:space="preserve">{sec5Intro}</w:t>
       </w:r>
     </w:p>
     <w:tbl>
@@ -530,6 +530,11 @@
     <w:p/>
     <w:p>
       <w:r>
+        <w:t>{#isAbrangida}</w:t>
+      </w:r>
+    </w:p>
+    <w:p>
+      <w:r>
         <w:t xml:space="preserve">  1. Confirme este enquadramento com assessor jurídico ou com a CNCS, se tiver dúvidas.</w:t>
       </w:r>
     </w:p>
@@ -551,6 +556,71 @@
     <w:p>
       <w:r>
         <w:t xml:space="preserve">  5. Planeie a implementação das medidas de gestão de risco (Art. 27.º-30.º) dentro do prazo.</w:t>
+      </w:r>
+    </w:p>
+    <w:p>
+      <w:r>
+        <w:t>{/isAbrangida}</w:t>
+      </w:r>
+    </w:p>
+    <w:p>
+      <w:r>
+        <w:t>{#isFora}</w:t>
+      </w:r>
+    </w:p>
+    <w:p>
+      <w:r>
+        <w:t xml:space="preserve">  1. Confirme este enquadramento com assessor jurídico ou junto do CNCS. Este relatório é uma orientação preliminar e não substitui a qualificação oficial.</w:t>
+      </w:r>
+    </w:p>
+    <w:p>
+      <w:r>
+        <w:t xml:space="preserve">  2. Verifique se lhe são aplicáveis os critérios qualitativos do artigo 3.º, n.º 2, do RJC — nomeadamente ser o único prestador de um serviço essencial, ou a organização prestar serviços de comunicações eletrónicas, serviços de confiança ou serviços de DNS e registo de domínios, casos em que a dimensão é irrelevante.</w:t>
+      </w:r>
+    </w:p>
+    <w:p>
+      <w:r>
+        <w:t xml:space="preserve">  3. Reavalie o enquadramento se a dimensão da organização aumentar ou se a estrutura de grupo se alterar.</w:t>
+      </w:r>
+    </w:p>
+    <w:p>
+      <w:r>
+        <w:t xml:space="preserve">  4. Ainda que não abrangida, pode adotar voluntariamente o Quadro Nacional de Referência para a Cibersegurança. O CNCS pode recomendá-lo a entidades fora do âmbito de aplicação (artigo 24.º, n.º 2, e artigo 30.º, n.º 8, do Regulamento n.º 756/2026).</w:t>
+      </w:r>
+    </w:p>
+    <w:p>
+      <w:r>
+        <w:t>{/isFora}</w:t>
+      </w:r>
+    </w:p>
+    <w:p>
+      <w:r>
+        <w:t>{#isAConfirmar}</w:t>
+      </w:r>
+    </w:p>
+    <w:p>
+      <w:r>
+        <w:t xml:space="preserve">  1. Confirme este enquadramento com assessor jurídico ou junto do CNCS. Este relatório é uma orientação preliminar e não substitui a qualificação oficial.</w:t>
+      </w:r>
+    </w:p>
+    <w:p>
+      <w:r>
+        <w:t xml:space="preserve">  2. Reúna os dados em falta que determinam o enquadramento — nomeadamente o balanço total anual e a estrutura de grupo — e repita a avaliação. São esses dados que decidem se a organização está abrangida e em que categoria.</w:t>
+      </w:r>
+    </w:p>
+    <w:p>
+      <w:r>
+        <w:t xml:space="preserve">  3. Verifique se lhe são aplicáveis os critérios qualitativos do artigo 3.º, n.º 2, do RJC, que abrangem determinadas entidades independentemente da dimensão.</w:t>
+      </w:r>
+    </w:p>
+    <w:p>
+      <w:r>
+        <w:t xml:space="preserve">  4. Caso se confirme que está abrangida, os passos aplicáveis são os descritos nas secções 3 e 4 deste relatório.</w:t>
+      </w:r>
+    </w:p>
+    <w:p>
+      <w:r>
+        <w:t>{/isAConfirmar}</w:t>
       </w:r>
     </w:p>
     <w:p/>

</xml_diff>

<commit_message>
fix(enquadramento): gerador ramifica por coverageState, nao adivinha
Tres sitios adivinhavam "abrangida/condicional/fora" por metodos diferentes:
isForaOuConfirmar (lista de classifications), string matching de "provavel"
no resultLabel, e ramificacao por classification. Tres adivinhacoes, tres
formas de falhar — era por isso que o "Provavel" aparecia e desaparecia e
que o ramo fornecedor recebia "o que a lei exige de si hoje".

Passam todas a ler coverageState do motor, num ponto de decisao unico.
isForaOuConfirmar removido; string matching removido.

Distincao juridica corrigida no "em vigor": a norma vigora na ordem juridica
desde 3 abr 2026 (facto); a exigibilidade a ESTA entidade e afirmativa
(abrangida), condicionada (condicional) ou negada (fora). Nao se afirma
exigibilidade a quem nao e abrangido.

Ramo fornecedor (a_confirmar_contratual) agora fixado por teste como
condicional.
</commit_message>
<xml_diff>
--- a/backend/assets/templates/enquadramento-template.docx
+++ b/backend/assets/templates/enquadramento-template.docx
@@ -154,7 +154,7 @@
     </w:p>
     <w:p>
       <w:r>
-        <w:t>{#isAConfirmar}</w:t>
+        <w:t>{#isCondicional}</w:t>
       </w:r>
     </w:p>
     <w:p>
@@ -164,7 +164,7 @@
     </w:p>
     <w:p>
       <w:r>
-        <w:t>{/isAConfirmar}</w:t>
+        <w:t>{/isCondicional}</w:t>
       </w:r>
     </w:p>
     <w:p/>
@@ -179,7 +179,7 @@
     </w:p>
     <w:p>
       <w:r>
-        <w:t xml:space="preserve">Estas obrigações estão em vigor desde a entrada em vigor do Regime Jurídico da Cibersegurança, em 3 de abril de 2026 (artigo 11.º do Decreto-Lei n.º 125/2025). O Regulamento n.º 756/2026, em vigor desde 23 de junho de 2026, não as criou: operacionalizou-as, definindo o funcionamento da plataforma eletrónica MyCiber e os procedimentos de autoidentificação, qualificação, comunicação e notificação.</w:t>
+        <w:t xml:space="preserve">{emVigorTexto}</w:t>
       </w:r>
     </w:p>
     <w:p>

</xml_diff>

<commit_message>
fix(enquadramento): template renomeia blocos orfaos isAConfirmar
O gerador passa isCondicional mas o template mantinha 2 blocos {#isAConfirmar}
(variavel desconhecida = falsy no docxtemplater) que nunca renderizavam — o
conteudo condicional desaparecia do .docx em silencio. Renomeados para
isCondicional. Confirmados os 3 flags (isAbrangida/isCondicional/isFora)
coerentes com coverageState, um por bloco do template.

Fecha a migracao coverageState: motor, gerador e template alinhados.
</commit_message>
<xml_diff>
--- a/backend/assets/templates/enquadramento-template.docx
+++ b/backend/assets/templates/enquadramento-template.docx
@@ -445,7 +445,7 @@
     </w:p>
     <w:p>
       <w:r>
-        <w:t>{#isAConfirmar}</w:t>
+        <w:t>{#isCondicional}</w:t>
       </w:r>
     </w:p>
     <w:p>
@@ -458,7 +458,7 @@
     </w:p>
     <w:p>
       <w:r>
-        <w:t>{/isAConfirmar}</w:t>
+        <w:t>{/isCondicional}</w:t>
       </w:r>
     </w:p>
     <w:p>
@@ -629,7 +629,7 @@
     </w:p>
     <w:p>
       <w:r>
-        <w:t>{#isAConfirmar}</w:t>
+        <w:t>{#isCondicional}</w:t>
       </w:r>
     </w:p>
     <w:p>
@@ -654,7 +654,7 @@
     </w:p>
     <w:p>
       <w:r>
-        <w:t>{/isAConfirmar}</w:t>
+        <w:t>{/isCondicional}</w:t>
       </w:r>
     </w:p>
     <w:p/>

</xml_diff>

<commit_message>
fix(enquadramento): injeta tblGrid de 4 colunas na tabela de coimas (tabela deixa de colapsar) + ignora backup local
</commit_message>
<xml_diff>
--- a/backend/assets/templates/enquadramento-template.docx
+++ b/backend/assets/templates/enquadramento-template.docx
@@ -278,6 +278,12 @@
           <w:insideV w:val="single" w:sz="4" w:space="0" w:color="000000"/>
         </w:tblBorders>
       </w:tblPr>
+      <w:tblGrid>
+        <w:gridCol w:w="1600"/>
+        <w:gridCol w:w="2900"/>
+        <w:gridCol w:w="2900"/>
+        <w:gridCol w:w="1600"/>
+      </w:tblGrid>
       <w:tr>
         <w:tc>
           <w:tcPr>

</xml_diff>